<commit_message>
Working process. Lots of models analysed. Proven neuron-13 work and arctan/softmax is better.
</commit_message>
<xml_diff>
--- a/theory.docx
+++ b/theory.docx
@@ -127,7 +127,21 @@
         <w:rPr>
           <w:bCs/>
         </w:rPr>
-        <w:t>|zj| = |</w:t>
+        <w:t>|</w:t>
+      </w:r>
+      <w:proofErr w:type="spellStart"/>
+      <w:r>
+        <w:rPr>
+          <w:bCs/>
+        </w:rPr>
+        <w:t>zj</w:t>
+      </w:r>
+      <w:proofErr w:type="spellEnd"/>
+      <w:r>
+        <w:rPr>
+          <w:bCs/>
+        </w:rPr>
+        <w:t>| = |</w:t>
       </w:r>
       <w:proofErr w:type="spellStart"/>
       <w:r>
@@ -377,13 +391,33 @@
         <w:rPr>
           <w:bCs/>
         </w:rPr>
-        <w:t xml:space="preserve"> after tough, sv3 starts to increase while sech^2 decreases – I think I will have to look at neuron’s individually</w:t>
-      </w:r>
-      <w:r>
-        <w:rPr>
-          <w:bCs/>
-        </w:rPr>
-        <w:t>. This is easier done for a small, e.g. 4 neuron networks, but this is hard to train, although I am trying.</w:t>
+        <w:t xml:space="preserve"> after tough, sv3 starts to increase while sech^2 decreases – I think I will have to look at </w:t>
+      </w:r>
+      <w:proofErr w:type="gramStart"/>
+      <w:r>
+        <w:rPr>
+          <w:bCs/>
+        </w:rPr>
+        <w:t>neuron’s</w:t>
+      </w:r>
+      <w:proofErr w:type="gramEnd"/>
+      <w:r>
+        <w:rPr>
+          <w:bCs/>
+        </w:rPr>
+        <w:t xml:space="preserve"> individually</w:t>
+      </w:r>
+      <w:r>
+        <w:rPr>
+          <w:bCs/>
+        </w:rPr>
+        <w:t xml:space="preserve">. This is easier done for a small, e.g. 4 neuron networks, but this is hard to train, although I am </w:t>
+      </w:r>
+      <w:r>
+        <w:rPr>
+          <w:bCs/>
+        </w:rPr>
+        <w:t>trying.</w:t>
       </w:r>
     </w:p>
     <w:p>
@@ -399,6 +433,58 @@
           <w:bCs/>
         </w:rPr>
       </w:pPr>
+      <w:r>
+        <w:rPr>
+          <w:bCs/>
+        </w:rPr>
+        <w:t xml:space="preserve">To further this, </w:t>
+      </w:r>
+      <w:r>
+        <w:rPr>
+          <w:bCs/>
+        </w:rPr>
+        <w:t xml:space="preserve">MSE rewards an average trajectory. A good model learns to </w:t>
+      </w:r>
+      <w:r>
+        <w:rPr>
+          <w:bCs/>
+        </w:rPr>
+        <w:t xml:space="preserve">overcorrect this </w:t>
+      </w:r>
+      <w:proofErr w:type="spellStart"/>
+      <w:r>
+        <w:rPr>
+          <w:bCs/>
+        </w:rPr>
+        <w:t>avgering</w:t>
+      </w:r>
+      <w:proofErr w:type="spellEnd"/>
+      <w:r>
+        <w:rPr>
+          <w:bCs/>
+        </w:rPr>
+        <w:t xml:space="preserve"> at fold points, via the above mechanism. A bad/small model </w:t>
+      </w:r>
+      <w:r>
+        <w:rPr>
+          <w:bCs/>
+        </w:rPr>
+        <w:t xml:space="preserve">has an </w:t>
+      </w:r>
+      <w:proofErr w:type="spellStart"/>
+      <w:r>
+        <w:rPr>
+          <w:bCs/>
+        </w:rPr>
+        <w:t>overaveraged</w:t>
+      </w:r>
+      <w:proofErr w:type="spellEnd"/>
+      <w:r>
+        <w:rPr>
+          <w:bCs/>
+        </w:rPr>
+        <w:t xml:space="preserve"> trajectory and less extreme SV decomp.</w:t>
+      </w:r>
     </w:p>
     <w:p>
       <w:pPr>
@@ -406,6 +492,192 @@
           <w:bCs/>
         </w:rPr>
       </w:pPr>
+      <w:r>
+        <w:rPr>
+          <w:bCs/>
+        </w:rPr>
+        <w:t>We implement a series of experiments:</w:t>
+      </w:r>
+    </w:p>
+    <w:p>
+      <w:pPr>
+        <w:pStyle w:val="ListParagraph"/>
+        <w:numPr>
+          <w:ilvl w:val="0"/>
+          <w:numId w:val="1"/>
+        </w:numPr>
+        <w:rPr>
+          <w:bCs/>
+        </w:rPr>
+      </w:pPr>
+      <w:r>
+        <w:rPr>
+          <w:bCs/>
+        </w:rPr>
+        <w:t xml:space="preserve">In the meantime, we test </w:t>
+      </w:r>
+      <w:proofErr w:type="spellStart"/>
+      <w:r>
+        <w:rPr>
+          <w:bCs/>
+        </w:rPr>
+        <w:t>initilisation</w:t>
+      </w:r>
+      <w:proofErr w:type="spellEnd"/>
+      <w:r>
+        <w:rPr>
+          <w:bCs/>
+        </w:rPr>
+        <w:t xml:space="preserve"> on </w:t>
+      </w:r>
+      <w:proofErr w:type="gramStart"/>
+      <w:r>
+        <w:rPr>
+          <w:bCs/>
+        </w:rPr>
+        <w:t>a</w:t>
+      </w:r>
+      <w:proofErr w:type="gramEnd"/>
+      <w:r>
+        <w:rPr>
+          <w:bCs/>
+        </w:rPr>
+        <w:t xml:space="preserve"> 8-width model </w:t>
+      </w:r>
+      <w:proofErr w:type="spellStart"/>
+      <w:r>
+        <w:rPr>
+          <w:bCs/>
+        </w:rPr>
+        <w:t>fro</w:t>
+      </w:r>
+      <w:proofErr w:type="spellEnd"/>
+      <w:r>
+        <w:rPr>
+          <w:bCs/>
+        </w:rPr>
+        <w:t xml:space="preserve"> a set dataset.</w:t>
+      </w:r>
+    </w:p>
+    <w:p>
+      <w:pPr>
+        <w:pStyle w:val="ListParagraph"/>
+        <w:numPr>
+          <w:ilvl w:val="0"/>
+          <w:numId w:val="1"/>
+        </w:numPr>
+        <w:rPr>
+          <w:bCs/>
+        </w:rPr>
+      </w:pPr>
+      <w:r>
+        <w:rPr>
+          <w:bCs/>
+        </w:rPr>
+        <w:t xml:space="preserve">Similarly, we test </w:t>
+      </w:r>
+      <w:proofErr w:type="spellStart"/>
+      <w:r>
+        <w:rPr>
+          <w:bCs/>
+        </w:rPr>
+        <w:t>datset</w:t>
+      </w:r>
+      <w:proofErr w:type="spellEnd"/>
+      <w:r>
+        <w:rPr>
+          <w:bCs/>
+        </w:rPr>
+        <w:t xml:space="preserve"> on a pre-initialised 8-width model.</w:t>
+      </w:r>
+    </w:p>
+    <w:p>
+      <w:pPr>
+        <w:pStyle w:val="ListParagraph"/>
+        <w:numPr>
+          <w:ilvl w:val="0"/>
+          <w:numId w:val="1"/>
+        </w:numPr>
+        <w:rPr>
+          <w:bCs/>
+        </w:rPr>
+      </w:pPr>
+      <w:r>
+        <w:rPr>
+          <w:bCs/>
+        </w:rPr>
+        <w:t xml:space="preserve">We must test the statistics of the smooth 8-width model to </w:t>
+      </w:r>
+      <w:r>
+        <w:rPr>
+          <w:bCs/>
+        </w:rPr>
+        <w:t>see if it is overcorrecting.</w:t>
+      </w:r>
+    </w:p>
+    <w:p>
+      <w:pPr>
+        <w:pStyle w:val="ListParagraph"/>
+        <w:numPr>
+          <w:ilvl w:val="0"/>
+          <w:numId w:val="1"/>
+        </w:numPr>
+        <w:rPr>
+          <w:bCs/>
+        </w:rPr>
+      </w:pPr>
+      <w:r>
+        <w:rPr>
+          <w:bCs/>
+        </w:rPr>
+        <w:t xml:space="preserve">We experiment as follows. At each step, iterate model and true system. Find the difference in SV or J between the true system and the model. The, reset the model trajectory to the </w:t>
+      </w:r>
+      <w:proofErr w:type="spellStart"/>
+      <w:r>
+        <w:rPr>
+          <w:bCs/>
+        </w:rPr>
+        <w:t>treu</w:t>
+      </w:r>
+      <w:proofErr w:type="spellEnd"/>
+      <w:r>
+        <w:rPr>
+          <w:bCs/>
+        </w:rPr>
+        <w:t xml:space="preserve"> system (might update to 5/10 steps). Hopefully, we see at most points the model is less extreme, and more extreme at the fold points.</w:t>
+      </w:r>
+    </w:p>
+    <w:p>
+      <w:pPr>
+        <w:pStyle w:val="ListParagraph"/>
+        <w:numPr>
+          <w:ilvl w:val="0"/>
+          <w:numId w:val="1"/>
+        </w:numPr>
+        <w:rPr>
+          <w:bCs/>
+        </w:rPr>
+      </w:pPr>
+      <w:r>
+        <w:rPr>
+          <w:bCs/>
+        </w:rPr>
+        <w:t xml:space="preserve">Then, we ca try KL-loss or </w:t>
+      </w:r>
+      <w:proofErr w:type="spellStart"/>
+      <w:r>
+        <w:rPr>
+          <w:bCs/>
+        </w:rPr>
+        <w:t>weierstruass</w:t>
+      </w:r>
+      <w:proofErr w:type="spellEnd"/>
+      <w:r>
+        <w:rPr>
+          <w:bCs/>
+        </w:rPr>
+        <w:t>.</w:t>
+      </w:r>
     </w:p>
     <w:sectPr>
       <w:pgSz w:w="11906" w:h="16838"/>
@@ -415,6 +687,126 @@
     </w:sectPr>
   </w:body>
 </w:document>
+</file>
+
+<file path=word/numbering.xml><?xml version="1.0" encoding="utf-8"?>
+<w:numbering xmlns:wpc="http://schemas.microsoft.com/office/word/2010/wordprocessingCanvas" xmlns:cx="http://schemas.microsoft.com/office/drawing/2014/chartex" xmlns:cx1="http://schemas.microsoft.com/office/drawing/2015/9/8/chartex" xmlns:cx2="http://schemas.microsoft.com/office/drawing/2015/10/21/chartex" xmlns:cx3="http://schemas.microsoft.com/office/drawing/2016/5/9/chartex" xmlns:cx4="http://schemas.microsoft.com/office/drawing/2016/5/10/chartex" xmlns:cx5="http://schemas.microsoft.com/office/drawing/2016/5/11/chartex" xmlns:cx6="http://schemas.microsoft.com/office/drawing/2016/5/12/chartex" xmlns:cx7="http://schemas.microsoft.com/office/drawing/2016/5/13/chartex" xmlns:cx8="http://schemas.microsoft.com/office/drawing/2016/5/14/chartex" xmlns:mc="http://schemas.openxmlformats.org/markup-compatibility/2006" xmlns:aink="http://schemas.microsoft.com/office/drawing/2016/ink" xmlns:am3d="http://schemas.microsoft.com/office/drawing/2017/model3d" xmlns:o="urn:schemas-microsoft-com:office:office" xmlns:oel="http://schemas.microsoft.com/office/2019/extlst" xmlns:r="http://schemas.openxmlformats.org/officeDocument/2006/relationships" xmlns:m="http://schemas.openxmlformats.org/officeDocument/2006/math" xmlns:v="urn:schemas-microsoft-com:vml" xmlns:wp14="http://schemas.microsoft.com/office/word/2010/wordprocessingDrawing" xmlns:wp="http://schemas.openxmlformats.org/drawingml/2006/wordprocessingDrawing" xmlns:w10="urn:schemas-microsoft-com:office:word" xmlns:w="http://schemas.openxmlformats.org/wordprocessingml/2006/main" xmlns:w14="http://schemas.microsoft.com/office/word/2010/wordml" xmlns:w15="http://schemas.microsoft.com/office/word/2012/wordml" xmlns:w16cex="http://schemas.microsoft.com/office/word/2018/wordml/cex" xmlns:w16cid="http://schemas.microsoft.com/office/word/2016/wordml/cid" xmlns:w16="http://schemas.microsoft.com/office/word/2018/wordml" xmlns:w16du="http://schemas.microsoft.com/office/word/2023/wordml/word16du" xmlns:w16sdtdh="http://schemas.microsoft.com/office/word/2020/wordml/sdtdatahash" xmlns:w16sdtfl="http://schemas.microsoft.com/office/word/2024/wordml/sdtformatlock" xmlns:w16se="http://schemas.microsoft.com/office/word/2015/wordml/symex" xmlns:wpg="http://schemas.microsoft.com/office/word/2010/wordprocessingGroup" xmlns:wpi="http://schemas.microsoft.com/office/word/2010/wordprocessingInk" xmlns:wne="http://schemas.microsoft.com/office/word/2006/wordml" xmlns:wps="http://schemas.microsoft.com/office/word/2010/wordprocessingShape" mc:Ignorable="w14 w15 w16se w16cid w16 w16cex w16sdtdh w16sdtfl w16du wp14">
+  <w:abstractNum w:abstractNumId="0" w15:restartNumberingAfterBreak="0">
+    <w:nsid w:val="1C2C0A4E"/>
+    <w:multiLevelType w:val="hybridMultilevel"/>
+    <w:tmpl w:val="8AD22402"/>
+    <w:lvl w:ilvl="0" w:tplc="F59C0992">
+      <w:numFmt w:val="bullet"/>
+      <w:lvlText w:val="-"/>
+      <w:lvlJc w:val="left"/>
+      <w:pPr>
+        <w:ind w:left="720" w:hanging="360"/>
+      </w:pPr>
+      <w:rPr>
+        <w:rFonts w:ascii="Aptos" w:eastAsiaTheme="minorHAnsi" w:hAnsi="Aptos" w:cstheme="minorBidi" w:hint="default"/>
+      </w:rPr>
+    </w:lvl>
+    <w:lvl w:ilvl="1" w:tplc="08090003" w:tentative="1">
+      <w:start w:val="1"/>
+      <w:numFmt w:val="bullet"/>
+      <w:lvlText w:val="o"/>
+      <w:lvlJc w:val="left"/>
+      <w:pPr>
+        <w:ind w:left="1440" w:hanging="360"/>
+      </w:pPr>
+      <w:rPr>
+        <w:rFonts w:ascii="Courier New" w:hAnsi="Courier New" w:cs="Courier New" w:hint="default"/>
+      </w:rPr>
+    </w:lvl>
+    <w:lvl w:ilvl="2" w:tplc="08090005" w:tentative="1">
+      <w:start w:val="1"/>
+      <w:numFmt w:val="bullet"/>
+      <w:lvlText w:val=""/>
+      <w:lvlJc w:val="left"/>
+      <w:pPr>
+        <w:ind w:left="2160" w:hanging="360"/>
+      </w:pPr>
+      <w:rPr>
+        <w:rFonts w:ascii="Wingdings" w:hAnsi="Wingdings" w:hint="default"/>
+      </w:rPr>
+    </w:lvl>
+    <w:lvl w:ilvl="3" w:tplc="08090001" w:tentative="1">
+      <w:start w:val="1"/>
+      <w:numFmt w:val="bullet"/>
+      <w:lvlText w:val=""/>
+      <w:lvlJc w:val="left"/>
+      <w:pPr>
+        <w:ind w:left="2880" w:hanging="360"/>
+      </w:pPr>
+      <w:rPr>
+        <w:rFonts w:ascii="Symbol" w:hAnsi="Symbol" w:hint="default"/>
+      </w:rPr>
+    </w:lvl>
+    <w:lvl w:ilvl="4" w:tplc="08090003" w:tentative="1">
+      <w:start w:val="1"/>
+      <w:numFmt w:val="bullet"/>
+      <w:lvlText w:val="o"/>
+      <w:lvlJc w:val="left"/>
+      <w:pPr>
+        <w:ind w:left="3600" w:hanging="360"/>
+      </w:pPr>
+      <w:rPr>
+        <w:rFonts w:ascii="Courier New" w:hAnsi="Courier New" w:cs="Courier New" w:hint="default"/>
+      </w:rPr>
+    </w:lvl>
+    <w:lvl w:ilvl="5" w:tplc="08090005" w:tentative="1">
+      <w:start w:val="1"/>
+      <w:numFmt w:val="bullet"/>
+      <w:lvlText w:val=""/>
+      <w:lvlJc w:val="left"/>
+      <w:pPr>
+        <w:ind w:left="4320" w:hanging="360"/>
+      </w:pPr>
+      <w:rPr>
+        <w:rFonts w:ascii="Wingdings" w:hAnsi="Wingdings" w:hint="default"/>
+      </w:rPr>
+    </w:lvl>
+    <w:lvl w:ilvl="6" w:tplc="08090001" w:tentative="1">
+      <w:start w:val="1"/>
+      <w:numFmt w:val="bullet"/>
+      <w:lvlText w:val=""/>
+      <w:lvlJc w:val="left"/>
+      <w:pPr>
+        <w:ind w:left="5040" w:hanging="360"/>
+      </w:pPr>
+      <w:rPr>
+        <w:rFonts w:ascii="Symbol" w:hAnsi="Symbol" w:hint="default"/>
+      </w:rPr>
+    </w:lvl>
+    <w:lvl w:ilvl="7" w:tplc="08090003" w:tentative="1">
+      <w:start w:val="1"/>
+      <w:numFmt w:val="bullet"/>
+      <w:lvlText w:val="o"/>
+      <w:lvlJc w:val="left"/>
+      <w:pPr>
+        <w:ind w:left="5760" w:hanging="360"/>
+      </w:pPr>
+      <w:rPr>
+        <w:rFonts w:ascii="Courier New" w:hAnsi="Courier New" w:cs="Courier New" w:hint="default"/>
+      </w:rPr>
+    </w:lvl>
+    <w:lvl w:ilvl="8" w:tplc="08090005" w:tentative="1">
+      <w:start w:val="1"/>
+      <w:numFmt w:val="bullet"/>
+      <w:lvlText w:val=""/>
+      <w:lvlJc w:val="left"/>
+      <w:pPr>
+        <w:ind w:left="6480" w:hanging="360"/>
+      </w:pPr>
+      <w:rPr>
+        <w:rFonts w:ascii="Wingdings" w:hAnsi="Wingdings" w:hint="default"/>
+      </w:rPr>
+    </w:lvl>
+  </w:abstractNum>
+  <w:num w:numId="1" w16cid:durableId="489710838">
+    <w:abstractNumId w:val="0"/>
+  </w:num>
+</w:numbering>
 </file>
 
 <file path=word/styles.xml><?xml version="1.0" encoding="utf-8"?>

</xml_diff>